<commit_message>
Add Zenodo DOI to manuscript and README
</commit_message>
<xml_diff>
--- a/submission_package/main_manuscript/manuscript_bmj_ready_from_word_cleaned.docx
+++ b/submission_package/main_manuscript/manuscript_bmj_ready_from_word_cleaned.docx
@@ -3633,61 +3633,55 @@
         <w:pStyle w:val="FirstParagraph"/>
       </w:pPr>
       <w:r>
-        <w:t xml:space="preserve">Data and code are available in a public, open access GitHub repository.</w:t>
-      </w:r>
-      <w:r>
-        <w:t xml:space="preserve"> </w:t>
-      </w:r>
-      <w:r>
-        <w:t xml:space="preserve">The full Python simulation, including Monte Carlo uncertainty, parameter</w:t>
-      </w:r>
-      <w:r>
-        <w:t xml:space="preserve"> </w:t>
-      </w:r>
-      <w:r>
-        <w:t xml:space="preserve">correlations, plots and trial-level exports, is available at</w:t>
-      </w:r>
-      <w:r>
-        <w:t xml:space="preserve"> </w:t>
-      </w:r>
-      <w:r>
-        <w:t xml:space="preserve">https://github.com/levine63/Sentinel-Firewall/blob/main/submission_package/public_code_and_data/sentinel_firewall_model.py.</w:t>
-      </w:r>
-      <w:r>
-        <w:t xml:space="preserve"> </w:t>
-      </w:r>
-      <w:r>
-        <w:t xml:space="preserve">A deterministic spreadsheet with editable modal parameter values and live</w:t>
-      </w:r>
-      <w:r>
-        <w:t xml:space="preserve"> </w:t>
-      </w:r>
-      <w:r>
-        <w:t xml:space="preserve">formulas is available at</w:t>
-      </w:r>
-      <w:r>
-        <w:t xml:space="preserve"> </w:t>
-      </w:r>
-      <w:r>
-        <w:t xml:space="preserve">https://github.com/levine63/Sentinel-Firewall/blob/main/submission_package/public_code_and_data/Simulating_sentinel_safe_products.xlsx.</w:t>
-      </w:r>
-      <w:r>
-        <w:t xml:space="preserve"> </w:t>
-      </w:r>
-      <w:r>
-        <w:t xml:space="preserve">The spreadsheet is designed for easier local adaptation; the Python code</w:t>
-      </w:r>
-      <w:r>
-        <w:t xml:space="preserve"> </w:t>
-      </w:r>
-      <w:r>
-        <w:t xml:space="preserve">remains the authoritative source for the probabilistic sensitivity</w:t>
-      </w:r>
-      <w:r>
-        <w:t xml:space="preserve"> </w:t>
-      </w:r>
-      <w:r>
-        <w:t xml:space="preserve">analysis.</w:t>
+        <w:t xml:space="preserve">The code, spreadsheet, and supplementary materials are archived on</w:t>
+      </w:r>
+      <w:r>
+        <w:t xml:space="preserve"> </w:t>
+      </w:r>
+      <w:r>
+        <w:t xml:space="preserve">Zenodo at doi:10.5281/zenodo.19898684 and mirrored in a public GitHub</w:t>
+      </w:r>
+      <w:r>
+        <w:t xml:space="preserve"> </w:t>
+      </w:r>
+      <w:r>
+        <w:t xml:space="preserve">repository at https://github.com/levine63/Sentinel-Firewall. The full</w:t>
+      </w:r>
+      <w:r>
+        <w:t xml:space="preserve"> </w:t>
+      </w:r>
+      <w:r>
+        <w:t xml:space="preserve">Python simulation, including Monte Carlo uncertainty, parameter</w:t>
+      </w:r>
+      <w:r>
+        <w:t xml:space="preserve"> </w:t>
+      </w:r>
+      <w:r>
+        <w:t xml:space="preserve">correlations, plots and trial-level exports, is available in the public</w:t>
+      </w:r>
+      <w:r>
+        <w:t xml:space="preserve"> </w:t>
+      </w:r>
+      <w:r>
+        <w:t xml:space="preserve">repository together with a deterministic spreadsheet with editable modal</w:t>
+      </w:r>
+      <w:r>
+        <w:t xml:space="preserve"> </w:t>
+      </w:r>
+      <w:r>
+        <w:t xml:space="preserve">parameter values and live formulas. The spreadsheet is designed for</w:t>
+      </w:r>
+      <w:r>
+        <w:t xml:space="preserve"> </w:t>
+      </w:r>
+      <w:r>
+        <w:t xml:space="preserve">easier local adaptation; the Python code remains the authoritative</w:t>
+      </w:r>
+      <w:r>
+        <w:t xml:space="preserve"> </w:t>
+      </w:r>
+      <w:r>
+        <w:t xml:space="preserve">source for the probabilistic sensitivity analysis.</w:t>
       </w:r>
     </w:p>
     <w:bookmarkEnd w:id="35"/>

</xml_diff>